<commit_message>
changed SOITReport.docx to PDF
</commit_message>
<xml_diff>
--- a/DSR Reports - Examples/Nmap/SOITReport.docx
+++ b/DSR Reports - Examples/Nmap/SOITReport.docx
@@ -1316,14 +1316,7 @@
           <w:rFonts w:ascii="Times New Roman" w:hAnsi="Times New Roman" w:cs="Times New Roman"/>
           <w:lang w:val="en-GB"/>
         </w:rPr>
-        <w:t xml:space="preserve">For the machines on this network there are a few ports open that can be exploited, these vulnerable ports are </w:t>
-      </w:r>
-      <w:r>
-        <w:rPr>
-          <w:rFonts w:ascii="Times New Roman" w:hAnsi="Times New Roman" w:cs="Times New Roman"/>
-          <w:lang w:val="en-GB"/>
-        </w:rPr>
-        <w:t xml:space="preserve">generally Ports 22, </w:t>
+        <w:t xml:space="preserve">For the machines on this network there are a few ports open that can be exploited, these vulnerable ports are generally Ports 22, </w:t>
       </w:r>
       <w:r>
         <w:rPr>
@@ -1436,23 +1429,7 @@
           <w:i/>
           <w:iCs/>
         </w:rPr>
-        <w:t xml:space="preserve">A vulnerability in the Secure Shell (SSH) server code of Cisco IOS Software and Cisco IOS XE Software could allow an authenticated, remote attacker to cause an affected device to reload. The vulnerability is due to an internal state not being represented correctly in the SSH state machine, which leads to an unexpected </w:t>
-      </w:r>
-      <w:r>
-        <w:rPr>
-          <w:rFonts w:ascii="Times New Roman" w:hAnsi="Times New Roman" w:cs="Times New Roman"/>
-          <w:i/>
-          <w:iCs/>
-        </w:rPr>
-        <w:t>behaviour</w:t>
-      </w:r>
-      <w:r>
-        <w:rPr>
-          <w:rFonts w:ascii="Times New Roman" w:hAnsi="Times New Roman" w:cs="Times New Roman"/>
-          <w:i/>
-          <w:iCs/>
-        </w:rPr>
-        <w:t>. An attacker could exploit this vulnerability by creating an SSH connection to an affected device and using a specific traffic pattern that causes an error condition within that connection. A successful exploit could allow an attacker to cause the device to reload, resulting in a denial of service (DoS) condition.</w:t>
+        <w:t>A vulnerability in the Secure Shell (SSH) server code of Cisco IOS Software and Cisco IOS XE Software could allow an authenticated, remote attacker to cause an affected device to reload. The vulnerability is due to an internal state not being represented correctly in the SSH state machine, which leads to an unexpected behaviour. An attacker could exploit this vulnerability by creating an SSH connection to an affected device and using a specific traffic pattern that causes an error condition within that connection. A successful exploit could allow an attacker to cause the device to reload, resulting in a denial of service (DoS) condition.</w:t>
       </w:r>
     </w:p>
     <w:p>
@@ -2770,21 +2747,7 @@
           <w:rFonts w:ascii="Times New Roman" w:hAnsi="Times New Roman" w:cs="Times New Roman"/>
           <w:lang w:val="en-GB"/>
         </w:rPr>
-        <w:t xml:space="preserve"> this port provides direct access to database services. This being open </w:t>
-      </w:r>
-      <w:r>
-        <w:rPr>
-          <w:rFonts w:ascii="Times New Roman" w:hAnsi="Times New Roman" w:cs="Times New Roman"/>
-          <w:lang w:val="en-GB"/>
-        </w:rPr>
-        <w:t xml:space="preserve">means it is exposed and could be </w:t>
-      </w:r>
-      <w:r>
-        <w:rPr>
-          <w:rFonts w:ascii="Times New Roman" w:hAnsi="Times New Roman" w:cs="Times New Roman"/>
-          <w:lang w:val="en-GB"/>
-        </w:rPr>
-        <w:t xml:space="preserve">accessed through the internet. Common exploitations are brute force attacks which attack the logins leveraging automated tools to make thousands of requests. As well as direct SQL injection </w:t>
+        <w:t xml:space="preserve"> this port provides direct access to database services. This being open means it is exposed and could be accessed through the internet. Common exploitations are brute force attacks which attack the logins leveraging automated tools to make thousands of requests. As well as direct SQL injection </w:t>
       </w:r>
       <w:proofErr w:type="gramStart"/>
       <w:r>
@@ -6826,9 +6789,20 @@
         <w:jc w:val="both"/>
         <w:rPr>
           <w:rFonts w:ascii="Times New Roman" w:hAnsi="Times New Roman" w:cs="Times New Roman"/>
+          <w:i/>
+          <w:iCs/>
           <w:lang w:val="en-GB"/>
         </w:rPr>
       </w:pPr>
+      <w:r>
+        <w:rPr>
+          <w:rFonts w:ascii="Times New Roman" w:hAnsi="Times New Roman" w:cs="Times New Roman"/>
+          <w:i/>
+          <w:iCs/>
+          <w:lang w:val="en-GB"/>
+        </w:rPr>
+        <w:t>This report took approximately ~8 hours to Create</w:t>
+      </w:r>
     </w:p>
     <w:p>
       <w:pPr>
@@ -6902,21 +6876,7 @@
             <w:rStyle w:val="Hyperlink"/>
             <w:lang w:val="en-GB"/>
           </w:rPr>
-          <w:t>https://netwrix.com/</w:t>
-        </w:r>
-        <w:r>
-          <w:rPr>
-            <w:rStyle w:val="Hyperlink"/>
-            <w:lang w:val="en-GB"/>
-          </w:rPr>
-          <w:t>e</w:t>
-        </w:r>
-        <w:r>
-          <w:rPr>
-            <w:rStyle w:val="Hyperlink"/>
-            <w:lang w:val="en-GB"/>
-          </w:rPr>
-          <w:t>n/resources/blog/open-ports-vulnerability-list/</w:t>
+          <w:t>https://netwrix.com/en/resources/blog/open-ports-vulnerability-list/</w:t>
         </w:r>
       </w:hyperlink>
       <w:r>
@@ -7573,6 +7533,7 @@
   <w:style w:type="character" w:default="1" w:styleId="DefaultParagraphFont">
     <w:name w:val="Default Paragraph Font"/>
     <w:uiPriority w:val="1"/>
+    <w:semiHidden/>
     <w:unhideWhenUsed/>
   </w:style>
   <w:style w:type="table" w:default="1" w:styleId="TableNormal">

</xml_diff>